<commit_message>
v1.33.59: Session details modal + CaretakerHub restructure + ROADMAP AI section
- VisitDetailModal: format dates nicely (day name + month), add service type,
  location, and "awaiting assignment" for open sessions
- Sessions API: include care recipient location data in GET /sessions/:id
- CaretakerHub: restructure dashboard — "Next Up" (no completed),
  "Completed" section with recent sessions, clickable cards open detail modal
- CaretakerHub: widen check-in window from 15 min to 1 hour
- CaretakerHub: orange styling + "Check In" badge for sessions within 1 hour
- Dashboard API: add recentlyCompleted to caretaker response
- ROADMAP.docx: add AI-Powered Care Intelligence section (AI-1 through AI-5)

Co-Authored-By: Claude Opus 4.6 <noreply@anthropic.com>
</commit_message>
<xml_diff>
--- a/ROADMAP.docx
+++ b/ROADMAP.docx
@@ -2851,6 +2851,1147 @@
           <w:szCs w:val="22"/>
         </w:rPr>
         <w:t xml:space="preserve">✓ Email verification, test suite (53 tests), rate limiting</w:t>
+      </w:r>
+    </w:p>
+    <w:p>
+      <w:r>
+        <w:br w:type="page"/>
+      </w:r>
+    </w:p>
+    <w:p>
+      <w:pPr>
+        <w:pStyle w:val="Heading1"/>
+        <w:spacing w:before="360" w:after="120"/>
+      </w:pPr>
+      <w:r>
+        <w:rPr>
+          <w:rFonts w:ascii="Arial" w:cs="Arial" w:eastAsia="Arial" w:hAnsi="Arial"/>
+          <w:b/>
+          <w:bCs/>
+          <w:color w:val="1B6B5A"/>
+          <w:sz w:val="36"/>
+          <w:szCs w:val="36"/>
+        </w:rPr>
+        <w:t xml:space="preserve">Future — AI-Powered Care Intelligence</w:t>
+      </w:r>
+    </w:p>
+    <w:p>
+      <w:pPr>
+        <w:spacing w:after="120"/>
+      </w:pPr>
+      <w:r>
+        <w:rPr>
+          <w:rFonts w:ascii="Arial" w:cs="Arial" w:eastAsia="Arial" w:hAnsi="Arial"/>
+          <w:sz w:val="22"/>
+          <w:szCs w:val="22"/>
+        </w:rPr>
+        <w:t xml:space="preserve">Priority: </w:t>
+      </w:r>
+      <w:r>
+        <w:rPr>
+          <w:rFonts w:ascii="Arial" w:cs="Arial" w:eastAsia="Arial" w:hAnsi="Arial"/>
+          <w:b/>
+          <w:bCs/>
+          <w:color w:val="E8724A"/>
+          <w:sz w:val="22"/>
+          <w:szCs w:val="22"/>
+        </w:rPr>
+        <w:t xml:space="preserve">HIGH</w:t>
+      </w:r>
+      <w:r>
+        <w:rPr>
+          <w:rFonts w:ascii="Arial" w:cs="Arial" w:eastAsia="Arial" w:hAnsi="Arial"/>
+          <w:sz w:val="22"/>
+          <w:szCs w:val="22"/>
+        </w:rPr>
+        <w:t xml:space="preserve"> — Core differentiator. Matching is the lead feature for sales and investor pitch.</w:t>
+      </w:r>
+    </w:p>
+    <w:p>
+      <w:pPr>
+        <w:pStyle w:val="Heading2"/>
+        <w:spacing w:before="240" w:after="120"/>
+      </w:pPr>
+      <w:r>
+        <w:rPr>
+          <w:rFonts w:ascii="Arial" w:cs="Arial" w:eastAsia="Arial" w:hAnsi="Arial"/>
+          <w:b/>
+          <w:bCs/>
+          <w:color w:val="1B6B5A"/>
+          <w:sz w:val="28"/>
+          <w:szCs w:val="28"/>
+        </w:rPr>
+        <w:t xml:space="preserve">Why This Matters</w:t>
+      </w:r>
+    </w:p>
+    <w:p>
+      <w:pPr>
+        <w:spacing w:after="120"/>
+      </w:pPr>
+      <w:r>
+        <w:rPr>
+          <w:rFonts w:ascii="Arial" w:cs="Arial" w:eastAsia="Arial" w:hAnsi="Arial"/>
+          <w:sz w:val="22"/>
+          <w:szCs w:val="22"/>
+        </w:rPr>
+        <w:t xml:space="preserve">Most care platforms are glorified job boards — families scroll, guess, and hope. AI matching turns InPlace into something fundamentally different: a system that understands care needs and finds the right person. This is the pitch: “Tell us about your loved one. We’ll find the right caregiver.” One sentence, zero browsing.</w:t>
+      </w:r>
+    </w:p>
+    <w:p>
+      <w:pPr>
+        <w:pStyle w:val="Heading2"/>
+        <w:spacing w:before="240" w:after="120"/>
+      </w:pPr>
+      <w:r>
+        <w:rPr>
+          <w:rFonts w:ascii="Arial" w:cs="Arial" w:eastAsia="Arial" w:hAnsi="Arial"/>
+          <w:b/>
+          <w:bCs/>
+          <w:color w:val="1B6B5A"/>
+          <w:sz w:val="28"/>
+          <w:szCs w:val="28"/>
+        </w:rPr>
+        <w:t xml:space="preserve">Cost Analysis</w:t>
+      </w:r>
+    </w:p>
+    <w:p>
+      <w:pPr>
+        <w:spacing w:after="120"/>
+      </w:pPr>
+      <w:r>
+        <w:rPr>
+          <w:rFonts w:ascii="Arial" w:cs="Arial" w:eastAsia="Arial" w:hAnsi="Arial"/>
+          <w:sz w:val="22"/>
+          <w:szCs w:val="22"/>
+        </w:rPr>
+        <w:t xml:space="preserve">AI API costs are per-call, based on tokens (roughly 1 token ≈ 0.75 words). At 100 active users, total AI cost is roughly $20–35/month. At 1,000 users, $150–300/month. At 10,000 users, $1,000–2,500/month. This is easily covered by the platform fee (15–20% of session cost). A single 3-hour session at $25/hr generates $11–15 in platform revenue — that covers ~2,000 AI matching calls.</w:t>
+      </w:r>
+    </w:p>
+    <w:p>
+      <w:pPr>
+        <w:spacing w:after="60"/>
+      </w:pPr>
+      <w:r>
+        <w:rPr>
+          <w:rFonts w:ascii="Arial" w:cs="Arial" w:eastAsia="Arial" w:hAnsi="Arial"/>
+          <w:b/>
+          <w:bCs/>
+          <w:sz w:val="22"/>
+          <w:szCs w:val="22"/>
+        </w:rPr>
+        <w:t xml:space="preserve">Cost optimization levers:</w:t>
+      </w:r>
+    </w:p>
+    <w:p>
+      <w:pPr>
+        <w:pStyle w:val="ListParagraph"/>
+        <w:numPr>
+          <w:ilvl w:val="0"/>
+          <w:numId w:val="1"/>
+        </w:numPr>
+        <w:spacing w:after="60"/>
+      </w:pPr>
+      <w:r>
+        <w:rPr>
+          <w:rFonts w:ascii="Arial" w:cs="Arial" w:eastAsia="Arial" w:hAnsi="Arial"/>
+          <w:b/>
+          <w:bCs/>
+          <w:sz w:val="22"/>
+          <w:szCs w:val="22"/>
+        </w:rPr>
+        <w:t xml:space="preserve">Prompt caching</w:t>
+      </w:r>
+      <w:r>
+        <w:rPr>
+          <w:rFonts w:ascii="Arial" w:cs="Arial" w:eastAsia="Arial" w:hAnsi="Arial"/>
+          <w:sz w:val="22"/>
+          <w:szCs w:val="22"/>
+        </w:rPr>
+        <w:t xml:space="preserve"> — 90% savings on repeated context. A cached match request drops from $0.005 to ~$0.001.</w:t>
+      </w:r>
+    </w:p>
+    <w:p>
+      <w:pPr>
+        <w:pStyle w:val="ListParagraph"/>
+        <w:numPr>
+          <w:ilvl w:val="0"/>
+          <w:numId w:val="1"/>
+        </w:numPr>
+        <w:spacing w:after="60"/>
+      </w:pPr>
+      <w:r>
+        <w:rPr>
+          <w:rFonts w:ascii="Arial" w:cs="Arial" w:eastAsia="Arial" w:hAnsi="Arial"/>
+          <w:b/>
+          <w:bCs/>
+          <w:sz w:val="22"/>
+          <w:szCs w:val="22"/>
+        </w:rPr>
+        <w:t xml:space="preserve">Batch API</w:t>
+      </w:r>
+      <w:r>
+        <w:rPr>
+          <w:rFonts w:ascii="Arial" w:cs="Arial" w:eastAsia="Arial" w:hAnsi="Arial"/>
+          <w:sz w:val="22"/>
+          <w:szCs w:val="22"/>
+        </w:rPr>
+        <w:t xml:space="preserve"> — 50% discount for non-urgent tasks (weekly summaries, trend analysis).</w:t>
+      </w:r>
+    </w:p>
+    <w:p>
+      <w:pPr>
+        <w:pStyle w:val="ListParagraph"/>
+        <w:numPr>
+          <w:ilvl w:val="0"/>
+          <w:numId w:val="1"/>
+        </w:numPr>
+        <w:spacing w:after="60"/>
+      </w:pPr>
+      <w:r>
+        <w:rPr>
+          <w:rFonts w:ascii="Arial" w:cs="Arial" w:eastAsia="Arial" w:hAnsi="Arial"/>
+          <w:b/>
+          <w:bCs/>
+          <w:sz w:val="22"/>
+          <w:szCs w:val="22"/>
+        </w:rPr>
+        <w:t xml:space="preserve">Model routing</w:t>
+      </w:r>
+      <w:r>
+        <w:rPr>
+          <w:rFonts w:ascii="Arial" w:cs="Arial" w:eastAsia="Arial" w:hAnsi="Arial"/>
+          <w:sz w:val="22"/>
+          <w:szCs w:val="22"/>
+        </w:rPr>
+        <w:t xml:space="preserve"> — Use cheaper models for simple tasks, reserve premium models for complex analysis.</w:t>
+      </w:r>
+    </w:p>
+    <w:p>
+      <w:pPr>
+        <w:pStyle w:val="ListParagraph"/>
+        <w:numPr>
+          <w:ilvl w:val="0"/>
+          <w:numId w:val="1"/>
+        </w:numPr>
+        <w:spacing w:after="120"/>
+      </w:pPr>
+      <w:r>
+        <w:rPr>
+          <w:rFonts w:ascii="Arial" w:cs="Arial" w:eastAsia="Arial" w:hAnsi="Arial"/>
+          <w:b/>
+          <w:bCs/>
+          <w:sz w:val="22"/>
+          <w:szCs w:val="22"/>
+        </w:rPr>
+        <w:t xml:space="preserve">Result caching</w:t>
+      </w:r>
+      <w:r>
+        <w:rPr>
+          <w:rFonts w:ascii="Arial" w:cs="Arial" w:eastAsia="Arial" w:hAnsi="Arial"/>
+          <w:sz w:val="22"/>
+          <w:szCs w:val="22"/>
+        </w:rPr>
+        <w:t xml:space="preserve"> — Cache match results for same care-recipient profile for 24h.</w:t>
+      </w:r>
+    </w:p>
+    <w:tbl>
+      <w:tblPr>
+        <w:tblW w:type="dxa" w:w="9360"/>
+        <w:tblLayout w:type="fixed"/>
+      </w:tblPr>
+      <w:tblGrid>
+        <w:gridCol w:w="9360"/>
+      </w:tblGrid>
+      <w:tr>
+        <w:tc>
+          <w:tcPr>
+            <w:tcW w:type="dxa" w:w="9360"/>
+            <w:tcBorders>
+              <w:top w:val="single" w:color="E8724A" w:sz="3"/>
+              <w:left w:val="single" w:color="E8724A" w:sz="3"/>
+              <w:bottom w:val="single" w:color="CCCCCC" w:sz="1"/>
+              <w:right w:val="single" w:color="CCCCCC" w:sz="1"/>
+            </w:tcBorders>
+            <w:shd w:fill="FFF3EE" w:val="clear"/>
+            <w:tcMar>
+              <w:top w:type="dxa" w:w="120"/>
+              <w:left w:type="dxa" w:w="200"/>
+              <w:bottom w:type="dxa" w:w="120"/>
+              <w:right w:type="dxa" w:w="200"/>
+            </w:tcMar>
+          </w:tcPr>
+          <w:p>
+            <w:r>
+              <w:rPr>
+                <w:rFonts w:ascii="Arial" w:cs="Arial" w:eastAsia="Arial" w:hAnsi="Arial"/>
+                <w:b/>
+                <w:bCs/>
+                <w:color w:val="E8724A"/>
+                <w:sz w:val="28"/>
+                <w:szCs w:val="28"/>
+              </w:rPr>
+              <w:t xml:space="preserve">AI-1: </w:t>
+            </w:r>
+            <w:r>
+              <w:rPr>
+                <w:rFonts w:ascii="Arial" w:cs="Arial" w:eastAsia="Arial" w:hAnsi="Arial"/>
+                <w:b/>
+                <w:bCs/>
+                <w:sz w:val="28"/>
+                <w:szCs w:val="28"/>
+              </w:rPr>
+              <w:t xml:space="preserve">Intelligent Caregiver Matching (v2.5.0)</w:t>
+            </w:r>
+          </w:p>
+          <w:p>
+            <w:r>
+              <w:rPr>
+                <w:rFonts w:ascii="Arial" w:cs="Arial" w:eastAsia="Arial" w:hAnsi="Arial"/>
+                <w:color w:val="666666"/>
+                <w:sz w:val="20"/>
+                <w:szCs w:val="20"/>
+              </w:rPr>
+              <w:t xml:space="preserve">Target: Q3 2026  |  </w:t>
+            </w:r>
+            <w:r>
+              <w:rPr>
+                <w:rFonts w:ascii="Arial" w:cs="Arial" w:eastAsia="Arial" w:hAnsi="Arial"/>
+                <w:b/>
+                <w:bCs/>
+                <w:color w:val="E8724A"/>
+                <w:sz w:val="20"/>
+                <w:szCs w:val="20"/>
+              </w:rPr>
+              <w:t xml:space="preserve">PLANNED — Lead Feature</w:t>
+            </w:r>
+          </w:p>
+        </w:tc>
+      </w:tr>
+    </w:tbl>
+    <w:p>
+      <w:pPr>
+        <w:spacing w:before="120" w:after="60"/>
+      </w:pPr>
+      <w:r>
+        <w:rPr>
+          <w:rFonts w:ascii="Arial" w:cs="Arial" w:eastAsia="Arial" w:hAnsi="Arial"/>
+          <w:i/>
+          <w:iCs/>
+          <w:sz w:val="22"/>
+          <w:szCs w:val="22"/>
+        </w:rPr>
+        <w:t xml:space="preserve">The headline feature. Family describes what they need → AI returns ranked caregivers with explanations.</w:t>
+      </w:r>
+    </w:p>
+    <w:p>
+      <w:pPr>
+        <w:pStyle w:val="ListParagraph"/>
+        <w:numPr>
+          <w:ilvl w:val="0"/>
+          <w:numId w:val="1"/>
+        </w:numPr>
+        <w:spacing w:after="60"/>
+      </w:pPr>
+      <w:r>
+        <w:rPr>
+          <w:rFonts w:ascii="Arial" w:cs="Arial" w:eastAsia="Arial" w:hAnsi="Arial"/>
+          <w:sz w:val="22"/>
+          <w:szCs w:val="22"/>
+        </w:rPr>
+        <w:t xml:space="preserve">Care recipient conditions vs. caregiver specialties + stoplight preferences</w:t>
+      </w:r>
+    </w:p>
+    <w:p>
+      <w:pPr>
+        <w:pStyle w:val="ListParagraph"/>
+        <w:numPr>
+          <w:ilvl w:val="0"/>
+          <w:numId w:val="1"/>
+        </w:numPr>
+        <w:spacing w:after="60"/>
+      </w:pPr>
+      <w:r>
+        <w:rPr>
+          <w:rFonts w:ascii="Arial" w:cs="Arial" w:eastAsia="Arial" w:hAnsi="Arial"/>
+          <w:sz w:val="22"/>
+          <w:szCs w:val="22"/>
+        </w:rPr>
+        <w:t xml:space="preserve">Schedule fit, past performance, distance, and rate compatibility</w:t>
+      </w:r>
+    </w:p>
+    <w:p>
+      <w:pPr>
+        <w:pStyle w:val="ListParagraph"/>
+        <w:numPr>
+          <w:ilvl w:val="0"/>
+          <w:numId w:val="1"/>
+        </w:numPr>
+        <w:spacing w:after="60"/>
+      </w:pPr>
+      <w:r>
+        <w:rPr>
+          <w:rFonts w:ascii="Arial" w:cs="Arial" w:eastAsia="Arial" w:hAnsi="Arial"/>
+          <w:sz w:val="22"/>
+          <w:szCs w:val="22"/>
+        </w:rPr>
+        <w:t xml:space="preserve">Returns top 3–5 matches with plain-English explanations</w:t>
+      </w:r>
+    </w:p>
+    <w:p>
+      <w:pPr>
+        <w:pStyle w:val="ListParagraph"/>
+        <w:numPr>
+          <w:ilvl w:val="0"/>
+          <w:numId w:val="1"/>
+        </w:numPr>
+        <w:spacing w:after="60"/>
+      </w:pPr>
+      <w:r>
+        <w:rPr>
+          <w:rFonts w:ascii="Arial" w:cs="Arial" w:eastAsia="Arial" w:hAnsi="Arial"/>
+          <w:sz w:val="22"/>
+          <w:szCs w:val="22"/>
+        </w:rPr>
+        <w:t xml:space="preserve">iPAi badge on AI-powered results for transparency</w:t>
+      </w:r>
+    </w:p>
+    <w:p>
+      <w:pPr>
+        <w:pStyle w:val="ListParagraph"/>
+        <w:numPr>
+          <w:ilvl w:val="0"/>
+          <w:numId w:val="1"/>
+        </w:numPr>
+        <w:spacing w:after="120"/>
+      </w:pPr>
+      <w:r>
+        <w:rPr>
+          <w:rFonts w:ascii="Arial" w:cs="Arial" w:eastAsia="Arial" w:hAnsi="Arial"/>
+          <w:sz w:val="22"/>
+          <w:szCs w:val="22"/>
+        </w:rPr>
+        <w:t xml:space="preserve">Estimated effort: 2–3 days | Cost: &lt;$5/month at current scale</w:t>
+      </w:r>
+    </w:p>
+    <w:tbl>
+      <w:tblPr>
+        <w:tblW w:type="dxa" w:w="9360"/>
+        <w:tblLayout w:type="fixed"/>
+      </w:tblPr>
+      <w:tblGrid>
+        <w:gridCol w:w="9360"/>
+      </w:tblGrid>
+      <w:tr>
+        <w:tc>
+          <w:tcPr>
+            <w:tcW w:type="dxa" w:w="9360"/>
+            <w:tcBorders>
+              <w:top w:val="single" w:color="1B6B5A" w:sz="3"/>
+              <w:left w:val="single" w:color="1B6B5A" w:sz="3"/>
+              <w:bottom w:val="single" w:color="CCCCCC" w:sz="1"/>
+              <w:right w:val="single" w:color="CCCCCC" w:sz="1"/>
+            </w:tcBorders>
+            <w:shd w:fill="EFF8F5" w:val="clear"/>
+            <w:tcMar>
+              <w:top w:type="dxa" w:w="120"/>
+              <w:left w:type="dxa" w:w="200"/>
+              <w:bottom w:type="dxa" w:w="120"/>
+              <w:right w:type="dxa" w:w="200"/>
+            </w:tcMar>
+          </w:tcPr>
+          <w:p>
+            <w:r>
+              <w:rPr>
+                <w:rFonts w:ascii="Arial" w:cs="Arial" w:eastAsia="Arial" w:hAnsi="Arial"/>
+                <w:b/>
+                <w:bCs/>
+                <w:color w:val="1B6B5A"/>
+                <w:sz w:val="28"/>
+                <w:szCs w:val="28"/>
+              </w:rPr>
+              <w:t xml:space="preserve">AI-2: </w:t>
+            </w:r>
+            <w:r>
+              <w:rPr>
+                <w:rFonts w:ascii="Arial" w:cs="Arial" w:eastAsia="Arial" w:hAnsi="Arial"/>
+                <w:b/>
+                <w:bCs/>
+                <w:sz w:val="28"/>
+                <w:szCs w:val="28"/>
+              </w:rPr>
+              <w:t xml:space="preserve">Session Note Intelligence (v2.6.0)</w:t>
+            </w:r>
+          </w:p>
+          <w:p>
+            <w:r>
+              <w:rPr>
+                <w:rFonts w:ascii="Arial" w:cs="Arial" w:eastAsia="Arial" w:hAnsi="Arial"/>
+                <w:color w:val="666666"/>
+                <w:sz w:val="20"/>
+                <w:szCs w:val="20"/>
+              </w:rPr>
+              <w:t xml:space="preserve">Target: Q4 2026  |  PLANNED</w:t>
+            </w:r>
+          </w:p>
+        </w:tc>
+      </w:tr>
+    </w:tbl>
+    <w:p>
+      <w:pPr>
+        <w:spacing w:before="120" w:after="60"/>
+      </w:pPr>
+      <w:r>
+        <w:rPr>
+          <w:rFonts w:ascii="Arial" w:cs="Arial" w:eastAsia="Arial" w:hAnsi="Arial"/>
+          <w:i/>
+          <w:iCs/>
+          <w:sz w:val="22"/>
+          <w:szCs w:val="22"/>
+        </w:rPr>
+        <w:t xml:space="preserve">Turn caregiver free-text notes into structured care insights.</w:t>
+      </w:r>
+    </w:p>
+    <w:p>
+      <w:pPr>
+        <w:pStyle w:val="ListParagraph"/>
+        <w:numPr>
+          <w:ilvl w:val="0"/>
+          <w:numId w:val="1"/>
+        </w:numPr>
+        <w:spacing w:after="60"/>
+      </w:pPr>
+      <w:r>
+        <w:rPr>
+          <w:rFonts w:ascii="Arial" w:cs="Arial" w:eastAsia="Arial" w:hAnsi="Arial"/>
+          <w:sz w:val="22"/>
+          <w:szCs w:val="22"/>
+        </w:rPr>
+        <w:t xml:space="preserve">Extract structured data: mood, mobility, appetite, medication compliance, incidents</w:t>
+      </w:r>
+    </w:p>
+    <w:p>
+      <w:pPr>
+        <w:pStyle w:val="ListParagraph"/>
+        <w:numPr>
+          <w:ilvl w:val="0"/>
+          <w:numId w:val="1"/>
+        </w:numPr>
+        <w:spacing w:after="60"/>
+      </w:pPr>
+      <w:r>
+        <w:rPr>
+          <w:rFonts w:ascii="Arial" w:cs="Arial" w:eastAsia="Arial" w:hAnsi="Arial"/>
+          <w:sz w:val="22"/>
+          <w:szCs w:val="22"/>
+        </w:rPr>
+        <w:t xml:space="preserve">Weekly/monthly care summaries for families with trend tracking</w:t>
+      </w:r>
+    </w:p>
+    <w:p>
+      <w:pPr>
+        <w:pStyle w:val="ListParagraph"/>
+        <w:numPr>
+          <w:ilvl w:val="0"/>
+          <w:numId w:val="1"/>
+        </w:numPr>
+        <w:spacing w:after="60"/>
+      </w:pPr>
+      <w:r>
+        <w:rPr>
+          <w:rFonts w:ascii="Arial" w:cs="Arial" w:eastAsia="Arial" w:hAnsi="Arial"/>
+          <w:sz w:val="22"/>
+          <w:szCs w:val="22"/>
+        </w:rPr>
+        <w:t xml:space="preserve">Automated concern flags with push notifications to family</w:t>
+      </w:r>
+    </w:p>
+    <w:p>
+      <w:pPr>
+        <w:pStyle w:val="ListParagraph"/>
+        <w:numPr>
+          <w:ilvl w:val="0"/>
+          <w:numId w:val="1"/>
+        </w:numPr>
+        <w:spacing w:after="120"/>
+      </w:pPr>
+      <w:r>
+        <w:rPr>
+          <w:rFonts w:ascii="Arial" w:cs="Arial" w:eastAsia="Arial" w:hAnsi="Arial"/>
+          <w:sz w:val="22"/>
+          <w:szCs w:val="22"/>
+        </w:rPr>
+        <w:t xml:space="preserve">Estimated effort: 3–4 days | Cost: $5–10/month</w:t>
+      </w:r>
+    </w:p>
+    <w:tbl>
+      <w:tblPr>
+        <w:tblW w:type="dxa" w:w="9360"/>
+        <w:tblLayout w:type="fixed"/>
+      </w:tblPr>
+      <w:tblGrid>
+        <w:gridCol w:w="9360"/>
+      </w:tblGrid>
+      <w:tr>
+        <w:tc>
+          <w:tcPr>
+            <w:tcW w:type="dxa" w:w="9360"/>
+            <w:tcBorders>
+              <w:top w:val="single" w:color="1B6B5A" w:sz="3"/>
+              <w:left w:val="single" w:color="1B6B5A" w:sz="3"/>
+              <w:bottom w:val="single" w:color="CCCCCC" w:sz="1"/>
+              <w:right w:val="single" w:color="CCCCCC" w:sz="1"/>
+            </w:tcBorders>
+            <w:shd w:fill="EFF8F5" w:val="clear"/>
+            <w:tcMar>
+              <w:top w:type="dxa" w:w="120"/>
+              <w:left w:type="dxa" w:w="200"/>
+              <w:bottom w:type="dxa" w:w="120"/>
+              <w:right w:type="dxa" w:w="200"/>
+            </w:tcMar>
+          </w:tcPr>
+          <w:p>
+            <w:r>
+              <w:rPr>
+                <w:rFonts w:ascii="Arial" w:cs="Arial" w:eastAsia="Arial" w:hAnsi="Arial"/>
+                <w:b/>
+                <w:bCs/>
+                <w:color w:val="1B6B5A"/>
+                <w:sz w:val="28"/>
+                <w:szCs w:val="28"/>
+              </w:rPr>
+              <w:t xml:space="preserve">AI-3: </w:t>
+            </w:r>
+            <w:r>
+              <w:rPr>
+                <w:rFonts w:ascii="Arial" w:cs="Arial" w:eastAsia="Arial" w:hAnsi="Arial"/>
+                <w:b/>
+                <w:bCs/>
+                <w:sz w:val="28"/>
+                <w:szCs w:val="28"/>
+              </w:rPr>
+              <w:t xml:space="preserve">Smart Scheduling &amp; Demand Optimization (v2.7.0)</w:t>
+            </w:r>
+          </w:p>
+          <w:p>
+            <w:r>
+              <w:rPr>
+                <w:rFonts w:ascii="Arial" w:cs="Arial" w:eastAsia="Arial" w:hAnsi="Arial"/>
+                <w:color w:val="666666"/>
+                <w:sz w:val="20"/>
+                <w:szCs w:val="20"/>
+              </w:rPr>
+              <w:t xml:space="preserve">Target: Q1 2027  |  PLANNED</w:t>
+            </w:r>
+          </w:p>
+        </w:tc>
+      </w:tr>
+    </w:tbl>
+    <w:p>
+      <w:pPr>
+        <w:spacing w:before="120" w:after="60"/>
+      </w:pPr>
+      <w:r>
+        <w:rPr>
+          <w:rFonts w:ascii="Arial" w:cs="Arial" w:eastAsia="Arial" w:hAnsi="Arial"/>
+          <w:i/>
+          <w:iCs/>
+          <w:sz w:val="22"/>
+          <w:szCs w:val="22"/>
+        </w:rPr>
+        <w:t xml:space="preserve">Reduce empty caregiver hours. Reduce family costs. Increase platform revenue.</w:t>
+      </w:r>
+    </w:p>
+    <w:p>
+      <w:pPr>
+        <w:pStyle w:val="ListParagraph"/>
+        <w:numPr>
+          <w:ilvl w:val="0"/>
+          <w:numId w:val="1"/>
+        </w:numPr>
+        <w:spacing w:after="60"/>
+      </w:pPr>
+      <w:r>
+        <w:rPr>
+          <w:rFonts w:ascii="Arial" w:cs="Arial" w:eastAsia="Arial" w:hAnsi="Arial"/>
+          <w:sz w:val="22"/>
+          <w:szCs w:val="22"/>
+        </w:rPr>
+        <w:t xml:space="preserve">Gap filling: proactive offers for caregiver downtime between sessions</w:t>
+      </w:r>
+    </w:p>
+    <w:p>
+      <w:pPr>
+        <w:pStyle w:val="ListParagraph"/>
+        <w:numPr>
+          <w:ilvl w:val="0"/>
+          <w:numId w:val="1"/>
+        </w:numPr>
+        <w:spacing w:after="60"/>
+      </w:pPr>
+      <w:r>
+        <w:rPr>
+          <w:rFonts w:ascii="Arial" w:cs="Arial" w:eastAsia="Arial" w:hAnsi="Arial"/>
+          <w:sz w:val="22"/>
+          <w:szCs w:val="22"/>
+        </w:rPr>
+        <w:t xml:space="preserve">Demand-based rate suggestions, transparent to both sides</w:t>
+      </w:r>
+    </w:p>
+    <w:p>
+      <w:pPr>
+        <w:pStyle w:val="ListParagraph"/>
+        <w:numPr>
+          <w:ilvl w:val="0"/>
+          <w:numId w:val="1"/>
+        </w:numPr>
+        <w:spacing w:after="60"/>
+      </w:pPr>
+      <w:r>
+        <w:rPr>
+          <w:rFonts w:ascii="Arial" w:cs="Arial" w:eastAsia="Arial" w:hAnsi="Arial"/>
+          <w:sz w:val="22"/>
+          <w:szCs w:val="22"/>
+        </w:rPr>
+        <w:t xml:space="preserve">Rebooking prompts and route-optimized scheduling for caregivers</w:t>
+      </w:r>
+    </w:p>
+    <w:p>
+      <w:pPr>
+        <w:pStyle w:val="ListParagraph"/>
+        <w:numPr>
+          <w:ilvl w:val="0"/>
+          <w:numId w:val="1"/>
+        </w:numPr>
+        <w:spacing w:after="120"/>
+      </w:pPr>
+      <w:r>
+        <w:rPr>
+          <w:rFonts w:ascii="Arial" w:cs="Arial" w:eastAsia="Arial" w:hAnsi="Arial"/>
+          <w:sz w:val="22"/>
+          <w:szCs w:val="22"/>
+        </w:rPr>
+        <w:t xml:space="preserve">Estimated effort: 4–5 days | Cost: $3–8/month</w:t>
+      </w:r>
+    </w:p>
+    <w:tbl>
+      <w:tblPr>
+        <w:tblW w:type="dxa" w:w="9360"/>
+        <w:tblLayout w:type="fixed"/>
+      </w:tblPr>
+      <w:tblGrid>
+        <w:gridCol w:w="9360"/>
+      </w:tblGrid>
+      <w:tr>
+        <w:tc>
+          <w:tcPr>
+            <w:tcW w:type="dxa" w:w="9360"/>
+            <w:tcBorders>
+              <w:top w:val="single" w:color="1B6B5A" w:sz="3"/>
+              <w:left w:val="single" w:color="1B6B5A" w:sz="3"/>
+              <w:bottom w:val="single" w:color="CCCCCC" w:sz="1"/>
+              <w:right w:val="single" w:color="CCCCCC" w:sz="1"/>
+            </w:tcBorders>
+            <w:shd w:fill="EFF8F5" w:val="clear"/>
+            <w:tcMar>
+              <w:top w:type="dxa" w:w="120"/>
+              <w:left w:type="dxa" w:w="200"/>
+              <w:bottom w:type="dxa" w:w="120"/>
+              <w:right w:type="dxa" w:w="200"/>
+            </w:tcMar>
+          </w:tcPr>
+          <w:p>
+            <w:r>
+              <w:rPr>
+                <w:rFonts w:ascii="Arial" w:cs="Arial" w:eastAsia="Arial" w:hAnsi="Arial"/>
+                <w:b/>
+                <w:bCs/>
+                <w:color w:val="1B6B5A"/>
+                <w:sz w:val="28"/>
+                <w:szCs w:val="28"/>
+              </w:rPr>
+              <w:t xml:space="preserve">AI-4: </w:t>
+            </w:r>
+            <w:r>
+              <w:rPr>
+                <w:rFonts w:ascii="Arial" w:cs="Arial" w:eastAsia="Arial" w:hAnsi="Arial"/>
+                <w:b/>
+                <w:bCs/>
+                <w:sz w:val="28"/>
+                <w:szCs w:val="28"/>
+              </w:rPr>
+              <w:t xml:space="preserve">Proactive Engagement &amp; Retention (v2.8.0)</w:t>
+            </w:r>
+          </w:p>
+          <w:p>
+            <w:r>
+              <w:rPr>
+                <w:rFonts w:ascii="Arial" w:cs="Arial" w:eastAsia="Arial" w:hAnsi="Arial"/>
+                <w:color w:val="666666"/>
+                <w:sz w:val="20"/>
+                <w:szCs w:val="20"/>
+              </w:rPr>
+              <w:t xml:space="preserve">Target: Q2 2027  |  PLANNED</w:t>
+            </w:r>
+          </w:p>
+        </w:tc>
+      </w:tr>
+    </w:tbl>
+    <w:p>
+      <w:pPr>
+        <w:spacing w:before="120" w:after="60"/>
+      </w:pPr>
+      <w:r>
+        <w:rPr>
+          <w:rFonts w:ascii="Arial" w:cs="Arial" w:eastAsia="Arial" w:hAnsi="Arial"/>
+          <w:i/>
+          <w:iCs/>
+          <w:sz w:val="22"/>
+          <w:szCs w:val="22"/>
+        </w:rPr>
+        <w:t xml:space="preserve">Keep families booking. Keep caregivers active. Reduce churn.</w:t>
+      </w:r>
+    </w:p>
+    <w:p>
+      <w:pPr>
+        <w:pStyle w:val="ListParagraph"/>
+        <w:numPr>
+          <w:ilvl w:val="0"/>
+          <w:numId w:val="1"/>
+        </w:numPr>
+        <w:spacing w:after="60"/>
+      </w:pPr>
+      <w:r>
+        <w:rPr>
+          <w:rFonts w:ascii="Arial" w:cs="Arial" w:eastAsia="Arial" w:hAnsi="Arial"/>
+          <w:sz w:val="22"/>
+          <w:szCs w:val="22"/>
+        </w:rPr>
+        <w:t xml:space="preserve">Re-engagement nudges, caregiver burnout detection, review prompts</w:t>
+      </w:r>
+    </w:p>
+    <w:p>
+      <w:pPr>
+        <w:pStyle w:val="ListParagraph"/>
+        <w:numPr>
+          <w:ilvl w:val="0"/>
+          <w:numId w:val="1"/>
+        </w:numPr>
+        <w:spacing w:after="60"/>
+      </w:pPr>
+      <w:r>
+        <w:rPr>
+          <w:rFonts w:ascii="Arial" w:cs="Arial" w:eastAsia="Arial" w:hAnsi="Arial"/>
+          <w:sz w:val="22"/>
+          <w:szCs w:val="22"/>
+        </w:rPr>
+        <w:t xml:space="preserve">Smart referral timing and onboarding coach for new caregivers</w:t>
+      </w:r>
+    </w:p>
+    <w:p>
+      <w:pPr>
+        <w:pStyle w:val="ListParagraph"/>
+        <w:numPr>
+          <w:ilvl w:val="0"/>
+          <w:numId w:val="1"/>
+        </w:numPr>
+        <w:spacing w:after="120"/>
+      </w:pPr>
+      <w:r>
+        <w:rPr>
+          <w:rFonts w:ascii="Arial" w:cs="Arial" w:eastAsia="Arial" w:hAnsi="Arial"/>
+          <w:sz w:val="22"/>
+          <w:szCs w:val="22"/>
+        </w:rPr>
+        <w:t xml:space="preserve">Estimated effort: 3–4 days | Cost: &lt;$5/month</w:t>
+      </w:r>
+    </w:p>
+    <w:tbl>
+      <w:tblPr>
+        <w:tblW w:type="dxa" w:w="9360"/>
+        <w:tblLayout w:type="fixed"/>
+      </w:tblPr>
+      <w:tblGrid>
+        <w:gridCol w:w="9360"/>
+      </w:tblGrid>
+      <w:tr>
+        <w:tc>
+          <w:tcPr>
+            <w:tcW w:type="dxa" w:w="9360"/>
+            <w:tcBorders>
+              <w:top w:val="single" w:color="1B6B5A" w:sz="3"/>
+              <w:left w:val="single" w:color="1B6B5A" w:sz="3"/>
+              <w:bottom w:val="single" w:color="CCCCCC" w:sz="1"/>
+              <w:right w:val="single" w:color="CCCCCC" w:sz="1"/>
+            </w:tcBorders>
+            <w:shd w:fill="EFF8F5" w:val="clear"/>
+            <w:tcMar>
+              <w:top w:type="dxa" w:w="120"/>
+              <w:left w:type="dxa" w:w="200"/>
+              <w:bottom w:type="dxa" w:w="120"/>
+              <w:right w:type="dxa" w:w="200"/>
+            </w:tcMar>
+          </w:tcPr>
+          <w:p>
+            <w:r>
+              <w:rPr>
+                <w:rFonts w:ascii="Arial" w:cs="Arial" w:eastAsia="Arial" w:hAnsi="Arial"/>
+                <w:b/>
+                <w:bCs/>
+                <w:color w:val="1B6B5A"/>
+                <w:sz w:val="28"/>
+                <w:szCs w:val="28"/>
+              </w:rPr>
+              <w:t xml:space="preserve">AI-5: </w:t>
+            </w:r>
+            <w:r>
+              <w:rPr>
+                <w:rFonts w:ascii="Arial" w:cs="Arial" w:eastAsia="Arial" w:hAnsi="Arial"/>
+                <w:b/>
+                <w:bCs/>
+                <w:sz w:val="28"/>
+                <w:szCs w:val="28"/>
+              </w:rPr>
+              <w:t xml:space="preserve">Family-Facing AI Assistant (v3.0.0)</w:t>
+            </w:r>
+          </w:p>
+          <w:p>
+            <w:r>
+              <w:rPr>
+                <w:rFonts w:ascii="Arial" w:cs="Arial" w:eastAsia="Arial" w:hAnsi="Arial"/>
+                <w:color w:val="666666"/>
+                <w:sz w:val="20"/>
+                <w:szCs w:val="20"/>
+              </w:rPr>
+              <w:t xml:space="preserve">Target: Q3 2027  |  PLANNED — Long Game</w:t>
+            </w:r>
+          </w:p>
+        </w:tc>
+      </w:tr>
+    </w:tbl>
+    <w:p>
+      <w:pPr>
+        <w:spacing w:before="120" w:after="60"/>
+      </w:pPr>
+      <w:r>
+        <w:rPr>
+          <w:rFonts w:ascii="Arial" w:cs="Arial" w:eastAsia="Arial" w:hAnsi="Arial"/>
+          <w:i/>
+          <w:iCs/>
+          <w:sz w:val="22"/>
+          <w:szCs w:val="22"/>
+        </w:rPr>
+        <w:t xml:space="preserve">Natural-language chat interface for families to ask about their loved one’s care.</w:t>
+      </w:r>
+    </w:p>
+    <w:p>
+      <w:pPr>
+        <w:pStyle w:val="ListParagraph"/>
+        <w:numPr>
+          <w:ilvl w:val="0"/>
+          <w:numId w:val="1"/>
+        </w:numPr>
+        <w:spacing w:after="60"/>
+      </w:pPr>
+      <w:r>
+        <w:rPr>
+          <w:rFonts w:ascii="Arial" w:cs="Arial" w:eastAsia="Arial" w:hAnsi="Arial"/>
+          <w:sz w:val="22"/>
+          <w:szCs w:val="22"/>
+        </w:rPr>
+        <w:t xml:space="preserve">“How has Mom been this month?” “Which caregiver is best for overnight stays?”</w:t>
+      </w:r>
+    </w:p>
+    <w:p>
+      <w:pPr>
+        <w:pStyle w:val="ListParagraph"/>
+        <w:numPr>
+          <w:ilvl w:val="0"/>
+          <w:numId w:val="1"/>
+        </w:numPr>
+        <w:spacing w:after="60"/>
+      </w:pPr>
+      <w:r>
+        <w:rPr>
+          <w:rFonts w:ascii="Arial" w:cs="Arial" w:eastAsia="Arial" w:hAnsi="Arial"/>
+          <w:sz w:val="22"/>
+          <w:szCs w:val="22"/>
+        </w:rPr>
+        <w:t xml:space="preserve">RAG system pulling from session history, visit notes, care profiles, caregiver data</w:t>
+      </w:r>
+    </w:p>
+    <w:p>
+      <w:pPr>
+        <w:pStyle w:val="ListParagraph"/>
+        <w:numPr>
+          <w:ilvl w:val="0"/>
+          <w:numId w:val="1"/>
+        </w:numPr>
+        <w:spacing w:after="120"/>
+      </w:pPr>
+      <w:r>
+        <w:rPr>
+          <w:rFonts w:ascii="Arial" w:cs="Arial" w:eastAsia="Arial" w:hAnsi="Arial"/>
+          <w:sz w:val="22"/>
+          <w:szCs w:val="22"/>
+        </w:rPr>
+        <w:t xml:space="preserve">Estimated effort: 2–3 weeks | Cost: $15–30/month</w:t>
+      </w:r>
+    </w:p>
+    <w:p>
+      <w:pPr>
+        <w:pStyle w:val="Heading2"/>
+        <w:spacing w:before="240" w:after="120"/>
+      </w:pPr>
+      <w:r>
+        <w:rPr>
+          <w:rFonts w:ascii="Arial" w:cs="Arial" w:eastAsia="Arial" w:hAnsi="Arial"/>
+          <w:b/>
+          <w:bCs/>
+          <w:color w:val="1B6B5A"/>
+          <w:sz w:val="28"/>
+          <w:szCs w:val="28"/>
+        </w:rPr>
+        <w:t xml:space="preserve">AI Implementation Notes</w:t>
+      </w:r>
+    </w:p>
+    <w:p>
+      <w:pPr>
+        <w:pStyle w:val="ListParagraph"/>
+        <w:numPr>
+          <w:ilvl w:val="0"/>
+          <w:numId w:val="1"/>
+        </w:numPr>
+        <w:spacing w:after="60"/>
+      </w:pPr>
+      <w:r>
+        <w:rPr>
+          <w:rFonts w:ascii="Arial" w:cs="Arial" w:eastAsia="Arial" w:hAnsi="Arial"/>
+          <w:b/>
+          <w:bCs/>
+          <w:sz w:val="22"/>
+          <w:szCs w:val="22"/>
+        </w:rPr>
+        <w:t xml:space="preserve">Architecture:</w:t>
+      </w:r>
+      <w:r>
+        <w:rPr>
+          <w:rFonts w:ascii="Arial" w:cs="Arial" w:eastAsia="Arial" w:hAnsi="Arial"/>
+          <w:sz w:val="22"/>
+          <w:szCs w:val="22"/>
+        </w:rPr>
+        <w:t xml:space="preserve"> All AI calls through src/utils/ai.js — single abstraction layer with provider switching, retry logic, timeout, and cost logging.</w:t>
+      </w:r>
+    </w:p>
+    <w:p>
+      <w:pPr>
+        <w:pStyle w:val="ListParagraph"/>
+        <w:numPr>
+          <w:ilvl w:val="0"/>
+          <w:numId w:val="1"/>
+        </w:numPr>
+        <w:spacing w:after="60"/>
+      </w:pPr>
+      <w:r>
+        <w:rPr>
+          <w:rFonts w:ascii="Arial" w:cs="Arial" w:eastAsia="Arial" w:hAnsi="Arial"/>
+          <w:b/>
+          <w:bCs/>
+          <w:sz w:val="22"/>
+          <w:szCs w:val="22"/>
+        </w:rPr>
+        <w:t xml:space="preserve">Graceful degradation:</w:t>
+      </w:r>
+      <w:r>
+        <w:rPr>
+          <w:rFonts w:ascii="Arial" w:cs="Arial" w:eastAsia="Arial" w:hAnsi="Arial"/>
+          <w:sz w:val="22"/>
+          <w:szCs w:val="22"/>
+        </w:rPr>
+        <w:t xml:space="preserve"> Every AI feature has a non-AI fallback (distance sort, manual browse, no summary).</w:t>
+      </w:r>
+    </w:p>
+    <w:p>
+      <w:pPr>
+        <w:pStyle w:val="ListParagraph"/>
+        <w:numPr>
+          <w:ilvl w:val="0"/>
+          <w:numId w:val="1"/>
+        </w:numPr>
+        <w:spacing w:after="60"/>
+      </w:pPr>
+      <w:r>
+        <w:rPr>
+          <w:rFonts w:ascii="Arial" w:cs="Arial" w:eastAsia="Arial" w:hAnsi="Arial"/>
+          <w:b/>
+          <w:bCs/>
+          <w:sz w:val="22"/>
+          <w:szCs w:val="22"/>
+        </w:rPr>
+        <w:t xml:space="preserve">Privacy:</w:t>
+      </w:r>
+      <w:r>
+        <w:rPr>
+          <w:rFonts w:ascii="Arial" w:cs="Arial" w:eastAsia="Arial" w:hAnsi="Arial"/>
+          <w:sz w:val="22"/>
+          <w:szCs w:val="22"/>
+        </w:rPr>
+        <w:t xml:space="preserve"> No PII sent to AI APIs — names replaced with IDs. Care health data sent for matching but not stored by providers (zero-retention policies).</w:t>
+      </w:r>
+    </w:p>
+    <w:p>
+      <w:pPr>
+        <w:pStyle w:val="ListParagraph"/>
+        <w:numPr>
+          <w:ilvl w:val="0"/>
+          <w:numId w:val="1"/>
+        </w:numPr>
+        <w:spacing w:after="60"/>
+      </w:pPr>
+      <w:r>
+        <w:rPr>
+          <w:rFonts w:ascii="Arial" w:cs="Arial" w:eastAsia="Arial" w:hAnsi="Arial"/>
+          <w:b/>
+          <w:bCs/>
+          <w:sz w:val="22"/>
+          <w:szCs w:val="22"/>
+        </w:rPr>
+        <w:t xml:space="preserve">iPAi branding:</w:t>
+      </w:r>
+      <w:r>
+        <w:rPr>
+          <w:rFonts w:ascii="Arial" w:cs="Arial" w:eastAsia="Arial" w:hAnsi="Arial"/>
+          <w:sz w:val="22"/>
+          <w:szCs w:val="22"/>
+        </w:rPr>
+        <w:t xml:space="preserve"> AI-powered results display an iPAi badge, letting users know they’re getting intelligent matching while keeping AI transparent and under the hood.</w:t>
+      </w:r>
+    </w:p>
+    <w:p>
+      <w:pPr>
+        <w:pStyle w:val="ListParagraph"/>
+        <w:numPr>
+          <w:ilvl w:val="0"/>
+          <w:numId w:val="1"/>
+        </w:numPr>
+        <w:spacing w:after="120"/>
+      </w:pPr>
+      <w:r>
+        <w:rPr>
+          <w:rFonts w:ascii="Arial" w:cs="Arial" w:eastAsia="Arial" w:hAnsi="Arial"/>
+          <w:b/>
+          <w:bCs/>
+          <w:sz w:val="22"/>
+          <w:szCs w:val="22"/>
+        </w:rPr>
+        <w:t xml:space="preserve">Opt-out:</w:t>
+      </w:r>
+      <w:r>
+        <w:rPr>
+          <w:rFonts w:ascii="Arial" w:cs="Arial" w:eastAsia="Arial" w:hAnsi="Arial"/>
+          <w:sz w:val="22"/>
+          <w:szCs w:val="22"/>
+        </w:rPr>
+        <w:t xml:space="preserve"> Families can disable AI features in account settings.</w:t>
       </w:r>
     </w:p>
     <w:p>

</xml_diff>